<commit_message>
Tidy: update speaker bios doc, add rabbi katz + sam waller source files
</commit_message>
<xml_diff>
--- a/Speaker Bios & Pictures/speaker bios.docx
+++ b/Speaker Bios & Pictures/speaker bios.docx
@@ -48,8 +48,19 @@
           <w:lang w:bidi="he-IL"/>
           <w14:ligatures w14:val="none"/>
         </w:rPr>
-        <w:t>Product Development – The Story of TheraBreath</w:t>
-      </w:r>
+        <w:t xml:space="preserve">Product Development – The Story of </w:t>
+      </w:r>
+      <w:proofErr w:type="spellStart"/>
+      <w:r>
+        <w:rPr>
+          <w:rFonts w:ascii="Times New Roman" w:eastAsia="Times New Roman" w:hAnsi="Times New Roman" w:cs="Times New Roman"/>
+          <w:kern w:val="0"/>
+          <w:lang w:bidi="he-IL"/>
+          <w14:ligatures w14:val="none"/>
+        </w:rPr>
+        <w:t>TheraBreath</w:t>
+      </w:r>
+      <w:proofErr w:type="spellEnd"/>
       <w:r>
         <w:rPr>
           <w:rFonts w:ascii="Times New Roman" w:eastAsia="Times New Roman" w:hAnsi="Times New Roman" w:cs="Times New Roman"/>
@@ -137,6 +148,7 @@
         </w:rPr>
         <w:t xml:space="preserve"> and the developer of the </w:t>
       </w:r>
+      <w:proofErr w:type="spellStart"/>
       <w:r>
         <w:rPr>
           <w:rFonts w:ascii="Times New Roman" w:eastAsia="Times New Roman" w:hAnsi="Times New Roman" w:cs="Times New Roman"/>
@@ -148,6 +160,7 @@
         </w:rPr>
         <w:t>TheraBreath</w:t>
       </w:r>
+      <w:proofErr w:type="spellEnd"/>
       <w:r>
         <w:rPr>
           <w:rFonts w:ascii="Times New Roman" w:eastAsia="Times New Roman" w:hAnsi="Times New Roman" w:cs="Times New Roman"/>
@@ -235,7 +248,27 @@
           <w:lang w:bidi="he-IL"/>
           <w14:ligatures w14:val="none"/>
         </w:rPr>
-        <w:t>Armed with this newly discovered knowledge, Dr. Katz began to experiment with oral rinse that would reduce the sulfur producing bacteria that cause bad breath. The resulting products were the beginning of the TheraBreath brand. In 1993 he founded the internationally acclaimed California Breath Clinics where he treated and studied patients with chronic bad breath, taste disorders, tonsil stones and dry mouth issues.</w:t>
+        <w:t xml:space="preserve">Armed with this newly discovered knowledge, Dr. Katz began to experiment with oral rinse that would reduce the sulfur producing bacteria that cause bad breath. The resulting products were the beginning of the </w:t>
+      </w:r>
+      <w:proofErr w:type="spellStart"/>
+      <w:r>
+        <w:rPr>
+          <w:rFonts w:ascii="Times New Roman" w:eastAsia="Times New Roman" w:hAnsi="Times New Roman" w:cs="Times New Roman"/>
+          <w:kern w:val="0"/>
+          <w:lang w:bidi="he-IL"/>
+          <w14:ligatures w14:val="none"/>
+        </w:rPr>
+        <w:t>TheraBreath</w:t>
+      </w:r>
+      <w:proofErr w:type="spellEnd"/>
+      <w:r>
+        <w:rPr>
+          <w:rFonts w:ascii="Times New Roman" w:eastAsia="Times New Roman" w:hAnsi="Times New Roman" w:cs="Times New Roman"/>
+          <w:kern w:val="0"/>
+          <w:lang w:bidi="he-IL"/>
+          <w14:ligatures w14:val="none"/>
+        </w:rPr>
+        <w:t xml:space="preserve"> brand. In 1993 he founded the internationally acclaimed California Breath Clinics where he treated and studied patients with chronic bad breath, taste disorders, tonsil stones and dry mouth issues.</w:t>
       </w:r>
     </w:p>
     <w:p>
@@ -573,14 +606,339 @@
     </w:p>
     <w:p>
       <w:pPr>
+        <w:pStyle w:val="NormalWeb"/>
+      </w:pPr>
+      <w:r>
+        <w:lastRenderedPageBreak/>
+        <w:t xml:space="preserve">Rabbi </w:t>
+      </w:r>
+      <w:r>
+        <w:t>Dr. David J. Katz</w:t>
+      </w:r>
+    </w:p>
+    <w:p>
+      <w:pPr>
         <w:spacing w:before="100" w:beforeAutospacing="1" w:after="100" w:afterAutospacing="1" w:line="240" w:lineRule="auto"/>
-        <w:rPr>
-          <w:rFonts w:ascii="Times New Roman" w:eastAsia="Times New Roman" w:hAnsi="Times New Roman" w:cs="Times New Roman"/>
-          <w:kern w:val="0"/>
-          <w:lang w:bidi="he-IL"/>
-          <w14:ligatures w14:val="none"/>
-        </w:rPr>
-      </w:pPr>
+        <w:outlineLvl w:val="2"/>
+        <w:rPr>
+          <w:rFonts w:ascii="Times New Roman" w:eastAsia="Times New Roman" w:hAnsi="Times New Roman" w:cs="Times New Roman"/>
+          <w:b/>
+          <w:bCs/>
+          <w:kern w:val="0"/>
+          <w:sz w:val="27"/>
+          <w:szCs w:val="27"/>
+          <w:lang w:bidi="he-IL"/>
+          <w14:ligatures w14:val="none"/>
+        </w:rPr>
+      </w:pPr>
+      <w:r>
+        <w:rPr>
+          <w:rFonts w:ascii="Times New Roman" w:eastAsia="Times New Roman" w:hAnsi="Times New Roman" w:cs="Times New Roman"/>
+          <w:b/>
+          <w:bCs/>
+          <w:kern w:val="0"/>
+          <w:sz w:val="27"/>
+          <w:szCs w:val="27"/>
+          <w:lang w:bidi="he-IL"/>
+          <w14:ligatures w14:val="none"/>
+        </w:rPr>
+        <w:t xml:space="preserve">Shalosh </w:t>
+      </w:r>
+      <w:proofErr w:type="spellStart"/>
+      <w:r>
+        <w:rPr>
+          <w:rFonts w:ascii="Times New Roman" w:eastAsia="Times New Roman" w:hAnsi="Times New Roman" w:cs="Times New Roman"/>
+          <w:b/>
+          <w:bCs/>
+          <w:kern w:val="0"/>
+          <w:sz w:val="27"/>
+          <w:szCs w:val="27"/>
+          <w:lang w:bidi="he-IL"/>
+          <w14:ligatures w14:val="none"/>
+        </w:rPr>
+        <w:t>Seudos</w:t>
+      </w:r>
+      <w:proofErr w:type="spellEnd"/>
+      <w:r>
+        <w:rPr>
+          <w:rFonts w:ascii="Times New Roman" w:eastAsia="Times New Roman" w:hAnsi="Times New Roman" w:cs="Times New Roman"/>
+          <w:b/>
+          <w:bCs/>
+          <w:kern w:val="0"/>
+          <w:sz w:val="27"/>
+          <w:szCs w:val="27"/>
+          <w:lang w:bidi="he-IL"/>
+          <w14:ligatures w14:val="none"/>
+        </w:rPr>
+        <w:t xml:space="preserve"> &amp; </w:t>
+      </w:r>
+      <w:r>
+        <w:rPr>
+          <w:rFonts w:ascii="Times New Roman" w:eastAsia="Times New Roman" w:hAnsi="Times New Roman" w:cs="Times New Roman"/>
+          <w:kern w:val="0"/>
+          <w:lang w:bidi="he-IL"/>
+          <w14:ligatures w14:val="none"/>
+        </w:rPr>
+        <w:t>Dental Halacha Shiur sponsored by Touro College of Dental Medicine</w:t>
+      </w:r>
+    </w:p>
+    <w:p>
+      <w:pPr>
+        <w:pStyle w:val="NormalWeb"/>
+      </w:pPr>
+      <w:r>
+        <w:t>Shabbos 6:30 PM</w:t>
+      </w:r>
+    </w:p>
+    <w:p>
+      <w:pPr>
+        <w:pStyle w:val="NormalWeb"/>
+      </w:pPr>
+      <w:r>
+        <w:t>1CE Credit</w:t>
+      </w:r>
+    </w:p>
+    <w:p>
+      <w:pPr>
+        <w:pStyle w:val="NormalWeb"/>
+      </w:pPr>
+      <w:r>
+        <w:t>Rabbi Dr. David J. Katz serves as Vice Dean for Clinical Affairs and Associate Professor of Dental Medicine at Touro College of Dental Medicine. He oversees Quality Assurance, Clinical Policy, D3 and D4 academic review, Infection Prevention, and related committees, and sits on the Senior Leadership committee.</w:t>
+      </w:r>
+    </w:p>
+    <w:p>
+      <w:pPr>
+        <w:pStyle w:val="NormalWeb"/>
+      </w:pPr>
+      <w:r>
+        <w:t>With more than 35 years of experience, he previously served as Associate Clinical Professor at Columbia University College of Dental Medicine and as Director of Oral Diagnosis and Treatment Planning at New York Presbyterian Hospital and Booth Memorial Hospital. He is a Fellow of the Academy of General Dentistry (FAGD) and has advanced training in Implantology. He received recognition from the City of New York and Congress for his service on the Dental Identification Unit following 9/11.</w:t>
+      </w:r>
+    </w:p>
+    <w:p>
+      <w:pPr>
+        <w:pStyle w:val="NormalWeb"/>
+      </w:pPr>
+      <w:r>
+        <w:t xml:space="preserve">Rabbi Dr. Katz is a leading authority on Jewish law as it applies to dentistry. He is the author of </w:t>
+      </w:r>
+      <w:r>
+        <w:rPr>
+          <w:rStyle w:val="Emphasis"/>
+        </w:rPr>
+        <w:t>Kesser Dovid: The Halachic Guide to Dentistry</w:t>
+      </w:r>
+      <w:r>
+        <w:t xml:space="preserve"> and has written numerous scholarly articles on the subject. He maintains a private practice in Teaneck, New Jersey, with Dr. Rebecca Block and serves on committees at New York Presbyterian Hospital–Queens.</w:t>
+      </w:r>
+    </w:p>
+    <w:p>
+      <w:pPr>
+        <w:rPr>
+          <w:rFonts w:ascii="Cambria" w:hAnsi="Cambria"/>
+          <w:color w:val="222222"/>
+          <w:sz w:val="19"/>
+          <w:szCs w:val="19"/>
+          <w:shd w:val="clear" w:color="auto" w:fill="FFFFFF"/>
+        </w:rPr>
+      </w:pPr>
+      <w:r>
+        <w:rPr>
+          <w:rFonts w:ascii="Times New Roman" w:hAnsi="Times New Roman" w:cs="Times New Roman"/>
+        </w:rPr>
+        <w:t xml:space="preserve">Sam </w:t>
+      </w:r>
+      <w:proofErr w:type="gramStart"/>
+      <w:r>
+        <w:rPr>
+          <w:rFonts w:ascii="Times New Roman" w:hAnsi="Times New Roman" w:cs="Times New Roman"/>
+        </w:rPr>
+        <w:t xml:space="preserve">Waller </w:t>
+      </w:r>
+      <w:r>
+        <w:rPr>
+          <w:rFonts w:ascii="Cambria" w:hAnsi="Cambria"/>
+          <w:color w:val="222222"/>
+          <w:sz w:val="19"/>
+          <w:szCs w:val="19"/>
+          <w:shd w:val="clear" w:color="auto" w:fill="FFFFFF"/>
+        </w:rPr>
+        <w:t>,</w:t>
+      </w:r>
+      <w:proofErr w:type="gramEnd"/>
+      <w:r>
+        <w:rPr>
+          <w:rFonts w:ascii="Cambria" w:hAnsi="Cambria"/>
+          <w:color w:val="222222"/>
+          <w:sz w:val="19"/>
+          <w:szCs w:val="19"/>
+          <w:shd w:val="clear" w:color="auto" w:fill="FFFFFF"/>
+        </w:rPr>
+        <w:t xml:space="preserve"> CFP®, RICP®, </w:t>
+      </w:r>
+      <w:proofErr w:type="spellStart"/>
+      <w:r>
+        <w:rPr>
+          <w:rFonts w:ascii="Cambria" w:hAnsi="Cambria"/>
+          <w:color w:val="222222"/>
+          <w:sz w:val="19"/>
+          <w:szCs w:val="19"/>
+          <w:shd w:val="clear" w:color="auto" w:fill="FFFFFF"/>
+        </w:rPr>
+        <w:t>ChFC</w:t>
+      </w:r>
+      <w:proofErr w:type="spellEnd"/>
+      <w:r>
+        <w:rPr>
+          <w:rFonts w:ascii="Cambria" w:hAnsi="Cambria"/>
+          <w:color w:val="222222"/>
+          <w:sz w:val="19"/>
+          <w:szCs w:val="19"/>
+          <w:shd w:val="clear" w:color="auto" w:fill="FFFFFF"/>
+        </w:rPr>
+        <w:t>®, CLU®</w:t>
+      </w:r>
+    </w:p>
+    <w:p>
+      <w:r>
+        <w:t xml:space="preserve">Life Insurance: </w:t>
+      </w:r>
+      <w:proofErr w:type="spellStart"/>
+      <w:r>
+        <w:t>Bitachon</w:t>
+      </w:r>
+      <w:proofErr w:type="spellEnd"/>
+      <w:r>
+        <w:t xml:space="preserve"> or </w:t>
+      </w:r>
+      <w:proofErr w:type="spellStart"/>
+      <w:r>
+        <w:t>Hishtadlus</w:t>
+      </w:r>
+      <w:proofErr w:type="spellEnd"/>
+      <w:r>
+        <w:t>? Navigating the Halachic Sources</w:t>
+      </w:r>
+    </w:p>
+    <w:p>
+      <w:r>
+        <w:t xml:space="preserve">Shabbos 4:30 </w:t>
+      </w:r>
+    </w:p>
+    <w:p>
+      <w:pPr>
+        <w:shd w:val="clear" w:color="auto" w:fill="FFFFFF"/>
+        <w:spacing w:after="0" w:line="240" w:lineRule="auto"/>
+        <w:rPr>
+          <w:rFonts w:ascii="Cambria" w:eastAsia="Times New Roman" w:hAnsi="Cambria" w:cs="Arial"/>
+          <w:color w:val="222222"/>
+          <w:kern w:val="0"/>
+          <w:sz w:val="22"/>
+          <w:szCs w:val="22"/>
+          <w:lang w:bidi="he-IL"/>
+          <w14:ligatures w14:val="none"/>
+        </w:rPr>
+      </w:pPr>
+      <w:r>
+        <w:rPr>
+          <w:rFonts w:ascii="Cambria" w:eastAsia="Times New Roman" w:hAnsi="Cambria" w:cs="Arial"/>
+          <w:color w:val="222222"/>
+          <w:kern w:val="0"/>
+          <w:sz w:val="22"/>
+          <w:szCs w:val="22"/>
+          <w:lang w:bidi="he-IL"/>
+          <w14:ligatures w14:val="none"/>
+        </w:rPr>
+        <w:t xml:space="preserve">Sam has been a Financial Planner and Wealth Management Advisor since 2002 and holds the CFP®, RICP®, </w:t>
+      </w:r>
+      <w:proofErr w:type="spellStart"/>
+      <w:r>
+        <w:rPr>
+          <w:rFonts w:ascii="Cambria" w:eastAsia="Times New Roman" w:hAnsi="Cambria" w:cs="Arial"/>
+          <w:color w:val="222222"/>
+          <w:kern w:val="0"/>
+          <w:sz w:val="22"/>
+          <w:szCs w:val="22"/>
+          <w:lang w:bidi="he-IL"/>
+          <w14:ligatures w14:val="none"/>
+        </w:rPr>
+        <w:t>ChFC</w:t>
+      </w:r>
+      <w:proofErr w:type="spellEnd"/>
+      <w:r>
+        <w:rPr>
+          <w:rFonts w:ascii="Cambria" w:eastAsia="Times New Roman" w:hAnsi="Cambria" w:cs="Arial"/>
+          <w:color w:val="222222"/>
+          <w:kern w:val="0"/>
+          <w:sz w:val="22"/>
+          <w:szCs w:val="22"/>
+          <w:lang w:bidi="he-IL"/>
+          <w14:ligatures w14:val="none"/>
+        </w:rPr>
+        <w:t>®, and CLU® designations. A Life and Qualifying Member of the Million Dollar Round Table, he specializes in comprehensive financial planning for attorneys, physicians, finance executives, and individuals approaching or in retirement.</w:t>
+      </w:r>
+    </w:p>
+    <w:p>
+      <w:pPr>
+        <w:shd w:val="clear" w:color="auto" w:fill="FFFFFF"/>
+        <w:spacing w:after="0" w:line="240" w:lineRule="auto"/>
+        <w:rPr>
+          <w:rFonts w:ascii="Arial" w:eastAsia="Times New Roman" w:hAnsi="Arial" w:cs="Arial"/>
+          <w:color w:val="222222"/>
+          <w:kern w:val="0"/>
+          <w:lang w:bidi="he-IL"/>
+          <w14:ligatures w14:val="none"/>
+        </w:rPr>
+      </w:pPr>
+    </w:p>
+    <w:p>
+      <w:pPr>
+        <w:shd w:val="clear" w:color="auto" w:fill="FFFFFF"/>
+        <w:spacing w:after="0" w:line="240" w:lineRule="auto"/>
+        <w:rPr>
+          <w:rFonts w:ascii="Arial" w:eastAsia="Times New Roman" w:hAnsi="Arial" w:cs="Arial"/>
+          <w:color w:val="222222"/>
+          <w:kern w:val="0"/>
+          <w:lang w:bidi="he-IL"/>
+          <w14:ligatures w14:val="none"/>
+        </w:rPr>
+      </w:pPr>
+      <w:r>
+        <w:rPr>
+          <w:rFonts w:ascii="Cambria" w:eastAsia="Times New Roman" w:hAnsi="Cambria" w:cs="Arial"/>
+          <w:color w:val="222222"/>
+          <w:kern w:val="0"/>
+          <w:sz w:val="22"/>
+          <w:szCs w:val="22"/>
+          <w:lang w:bidi="he-IL"/>
+          <w14:ligatures w14:val="none"/>
+        </w:rPr>
+        <w:t>His areas of focus include wealth management, fee-based financial planning, retirement income and distribution strategies, tax planning, risk mitigation, and insurance planning.</w:t>
+      </w:r>
+    </w:p>
+    <w:p>
+      <w:pPr>
+        <w:shd w:val="clear" w:color="auto" w:fill="FFFFFF"/>
+        <w:spacing w:after="0" w:line="240" w:lineRule="auto"/>
+        <w:rPr>
+          <w:rFonts w:ascii="Arial" w:eastAsia="Times New Roman" w:hAnsi="Arial" w:cs="Arial"/>
+          <w:color w:val="222222"/>
+          <w:kern w:val="0"/>
+          <w:lang w:bidi="he-IL"/>
+          <w14:ligatures w14:val="none"/>
+        </w:rPr>
+      </w:pPr>
+      <w:r>
+        <w:rPr>
+          <w:rFonts w:ascii="Cambria" w:eastAsia="Times New Roman" w:hAnsi="Cambria" w:cs="Arial"/>
+          <w:color w:val="222222"/>
+          <w:kern w:val="0"/>
+          <w:sz w:val="22"/>
+          <w:szCs w:val="22"/>
+          <w:lang w:bidi="he-IL"/>
+          <w14:ligatures w14:val="none"/>
+        </w:rPr>
+        <w:t>Sam and his wife Bruria live in the Five Towns with their four children. Outside of work, he enjoys coaching his kids' sports teams, reading, rooting for the NY Giants, and taking on any willing opponent in Scrabble or chess.</w:t>
+      </w:r>
     </w:p>
     <w:p>
       <w:pPr>
@@ -1549,6 +1907,17 @@
     <w:basedOn w:val="DefaultParagraphFont"/>
     <w:rsid w:val="00DA679E"/>
   </w:style>
+  <w:style w:type="character" w:styleId="Emphasis">
+    <w:name w:val="Emphasis"/>
+    <w:basedOn w:val="DefaultParagraphFont"/>
+    <w:uiPriority w:val="20"/>
+    <w:qFormat/>
+    <w:rsid w:val="00560B4C"/>
+    <w:rPr>
+      <w:i/>
+      <w:iCs/>
+    </w:rPr>
+  </w:style>
 </w:styles>
 </file>
 

</xml_diff>